<commit_message>
Cleanup lecture 7 and a bunch of sample code
</commit_message>
<xml_diff>
--- a/SOFTWARE ENGINEERING/Course Project Materials/D2.RequirementsDoc.docx
+++ b/SOFTWARE ENGINEERING/Course Project Materials/D2.RequirementsDoc.docx
@@ -5,7 +5,6 @@
     <w:p>
       <w:pPr>
         <w:pStyle w:val="Title"/>
-        <w:jc w:val="center"/>
       </w:pPr>
       <w:r>
         <w:rPr>
@@ -113,7 +112,6 @@
     <w:p>
       <w:pPr>
         <w:spacing w:before="180" w:after="180" w:line="240" w:lineRule="auto"/>
-        <w:jc w:val="both"/>
         <w:rPr>
           <w:rFonts w:ascii="Lato" w:eastAsia="Times New Roman" w:hAnsi="Lato" w:cs="Times New Roman"/>
           <w:b/>
@@ -156,7 +154,29 @@
           <w:szCs w:val="24"/>
           <w14:ligatures w14:val="none"/>
         </w:rPr>
-        <w:t xml:space="preserve"> template you will use in the second project deliverable (requirements document).</w:t>
+        <w:t xml:space="preserve"> template you </w:t>
+      </w:r>
+      <w:r>
+        <w:rPr>
+          <w:rFonts w:ascii="Lato" w:eastAsia="Times New Roman" w:hAnsi="Lato" w:cs="Times New Roman"/>
+          <w:color w:val="2D3B45"/>
+          <w:kern w:val="0"/>
+          <w:sz w:val="24"/>
+          <w:szCs w:val="24"/>
+          <w14:ligatures w14:val="none"/>
+        </w:rPr>
+        <w:t>are to complete as your</w:t>
+      </w:r>
+      <w:r>
+        <w:rPr>
+          <w:rFonts w:ascii="Lato" w:eastAsia="Times New Roman" w:hAnsi="Lato" w:cs="Times New Roman"/>
+          <w:color w:val="2D3B45"/>
+          <w:kern w:val="0"/>
+          <w:sz w:val="24"/>
+          <w:szCs w:val="24"/>
+          <w14:ligatures w14:val="none"/>
+        </w:rPr>
+        <w:t xml:space="preserve"> second project deliverable (requirements document).</w:t>
       </w:r>
       <w:r>
         <w:rPr>
@@ -266,7 +286,6 @@
     <w:p>
       <w:pPr>
         <w:spacing w:before="180" w:after="180" w:line="240" w:lineRule="auto"/>
-        <w:jc w:val="both"/>
         <w:rPr>
           <w:rFonts w:ascii="Lato" w:eastAsia="Times New Roman" w:hAnsi="Lato" w:cs="Times New Roman"/>
           <w:color w:val="2D3B45"/>
@@ -327,7 +346,6 @@
     <w:p>
       <w:pPr>
         <w:pStyle w:val="Heading1"/>
-        <w:jc w:val="both"/>
         <w:rPr>
           <w:rFonts w:eastAsia="Times New Roman"/>
         </w:rPr>
@@ -366,7 +384,6 @@
     <w:p>
       <w:pPr>
         <w:spacing w:before="180" w:after="180" w:line="240" w:lineRule="auto"/>
-        <w:jc w:val="both"/>
         <w:rPr>
           <w:rFonts w:ascii="Lato" w:eastAsia="Times New Roman" w:hAnsi="Lato" w:cs="Times New Roman"/>
           <w:color w:val="2D3B45"/>
@@ -428,7 +445,6 @@
     <w:p>
       <w:pPr>
         <w:spacing w:before="180" w:after="180" w:line="240" w:lineRule="auto"/>
-        <w:jc w:val="both"/>
         <w:rPr>
           <w:rFonts w:ascii="Lato" w:eastAsia="Times New Roman" w:hAnsi="Lato" w:cs="Times New Roman"/>
           <w:color w:val="2D3B45"/>
@@ -508,7 +524,55 @@
           <w14:ligatures w14:val="none"/>
         </w:rPr>
         <w:br/>
-        <w:t>b) referring to and stating the results of the earlier finalized needs analysis, in the form of a brief but clear expression of the user's problem(s). It explains what the system will and will not do to satisfy those needs;</w:t>
+        <w:t xml:space="preserve">b) referring to and stating the results </w:t>
+      </w:r>
+      <w:proofErr w:type="spellStart"/>
+      <w:proofErr w:type="gramStart"/>
+      <w:r>
+        <w:rPr>
+          <w:rFonts w:ascii="Lato" w:eastAsia="Times New Roman" w:hAnsi="Lato" w:cs="Times New Roman"/>
+          <w:color w:val="2D3B45"/>
+          <w:kern w:val="0"/>
+          <w:sz w:val="24"/>
+          <w:szCs w:val="24"/>
+          <w14:ligatures w14:val="none"/>
+        </w:rPr>
+        <w:t>o</w:t>
+      </w:r>
+      <w:r>
+        <w:rPr>
+          <w:rFonts w:ascii="Lato" w:eastAsia="Times New Roman" w:hAnsi="Lato" w:cs="Times New Roman"/>
+          <w:color w:val="2D3B45"/>
+          <w:kern w:val="0"/>
+          <w:sz w:val="24"/>
+          <w:szCs w:val="24"/>
+          <w14:ligatures w14:val="none"/>
+        </w:rPr>
+        <w:t xml:space="preserve">  </w:t>
+      </w:r>
+      <w:r>
+        <w:rPr>
+          <w:rFonts w:ascii="Lato" w:eastAsia="Times New Roman" w:hAnsi="Lato" w:cs="Times New Roman"/>
+          <w:color w:val="2D3B45"/>
+          <w:kern w:val="0"/>
+          <w:sz w:val="24"/>
+          <w:szCs w:val="24"/>
+          <w14:ligatures w14:val="none"/>
+        </w:rPr>
+        <w:t>f</w:t>
+      </w:r>
+      <w:proofErr w:type="spellEnd"/>
+      <w:proofErr w:type="gramEnd"/>
+      <w:r>
+        <w:rPr>
+          <w:rFonts w:ascii="Lato" w:eastAsia="Times New Roman" w:hAnsi="Lato" w:cs="Times New Roman"/>
+          <w:color w:val="2D3B45"/>
+          <w:kern w:val="0"/>
+          <w:sz w:val="24"/>
+          <w:szCs w:val="24"/>
+          <w14:ligatures w14:val="none"/>
+        </w:rPr>
+        <w:t xml:space="preserve"> the earlier finalized needs analysis, in the form of a brief but clear expression of the user's problem(s). It explains what the system will and will not do to satisfy those needs;</w:t>
       </w:r>
       <w:r>
         <w:rPr>
@@ -526,7 +590,6 @@
     <w:p>
       <w:pPr>
         <w:spacing w:before="180" w:after="240" w:line="240" w:lineRule="auto"/>
-        <w:jc w:val="both"/>
         <w:rPr>
           <w:rFonts w:ascii="Lato" w:eastAsia="Times New Roman" w:hAnsi="Lato" w:cs="Times New Roman"/>
           <w:color w:val="2D3B45"/>
@@ -606,7 +669,7 @@
           <w14:ligatures w14:val="none"/>
         </w:rPr>
         <w:br/>
-        <w:t xml:space="preserve">If the product is an element of a larger system, identify the interfaces between the product </w:t>
+        <w:t xml:space="preserve">If the product is an element of a larger system, identify the interfaces between the </w:t>
       </w:r>
       <w:r>
         <w:rPr>
@@ -618,7 +681,7 @@
           <w14:ligatures w14:val="none"/>
         </w:rPr>
         <w:lastRenderedPageBreak/>
-        <w:t>covered by the SRS and the larger system of which the product is an element.</w:t>
+        <w:t>product covered by the SRS and the larger system of which the product is an element.</w:t>
       </w:r>
       <w:r>
         <w:rPr>
@@ -724,7 +787,6 @@
     <w:p>
       <w:pPr>
         <w:spacing w:before="180" w:after="180" w:line="240" w:lineRule="auto"/>
-        <w:jc w:val="both"/>
         <w:rPr>
           <w:rFonts w:ascii="Lato" w:eastAsia="Times New Roman" w:hAnsi="Lato" w:cs="Times New Roman"/>
           <w:color w:val="2D3B45"/>
@@ -889,7 +951,6 @@
     <w:p>
       <w:pPr>
         <w:spacing w:before="180" w:after="180" w:line="240" w:lineRule="auto"/>
-        <w:jc w:val="both"/>
         <w:rPr>
           <w:rFonts w:ascii="Lato" w:eastAsia="Times New Roman" w:hAnsi="Lato" w:cs="Times New Roman"/>
           <w:color w:val="2D3B45"/>
@@ -1318,7 +1379,6 @@
     <w:p>
       <w:pPr>
         <w:spacing w:before="180" w:after="180" w:line="240" w:lineRule="auto"/>
-        <w:jc w:val="both"/>
         <w:rPr>
           <w:rFonts w:ascii="Lato" w:eastAsia="Times New Roman" w:hAnsi="Lato" w:cs="Times New Roman"/>
           <w:color w:val="2D3B45"/>
@@ -1393,7 +1453,6 @@
     <w:p>
       <w:pPr>
         <w:pStyle w:val="Heading1"/>
-        <w:jc w:val="both"/>
         <w:rPr>
           <w:rFonts w:eastAsia="Times New Roman"/>
         </w:rPr>
@@ -1425,7 +1484,6 @@
     <w:p>
       <w:pPr>
         <w:spacing w:before="180" w:after="180" w:line="240" w:lineRule="auto"/>
-        <w:jc w:val="both"/>
         <w:rPr>
           <w:rFonts w:ascii="Lato" w:eastAsia="Times New Roman" w:hAnsi="Lato" w:cs="Times New Roman"/>
           <w:color w:val="2D3B45"/>
@@ -1551,7 +1609,7 @@
           <w:szCs w:val="24"/>
           <w14:ligatures w14:val="none"/>
         </w:rPr>
-        <w:t xml:space="preserve"> This does not imply that the </w:t>
+        <w:t xml:space="preserve"> This does not imply that </w:t>
       </w:r>
       <w:r>
         <w:rPr>
@@ -1563,7 +1621,7 @@
           <w14:ligatures w14:val="none"/>
         </w:rPr>
         <w:lastRenderedPageBreak/>
-        <w:t>software/system design will also be partitioned that way.</w:t>
+        <w:t>the software/system design will also be partitioned that way.</w:t>
       </w:r>
       <w:r>
         <w:rPr>
@@ -1619,7 +1677,6 @@
     <w:p>
       <w:pPr>
         <w:spacing w:before="180" w:after="180" w:line="240" w:lineRule="auto"/>
-        <w:jc w:val="both"/>
         <w:rPr>
           <w:rFonts w:ascii="Lato" w:eastAsia="Times New Roman" w:hAnsi="Lato" w:cs="Times New Roman"/>
           <w:color w:val="2D3B45"/>
@@ -1730,7 +1787,6 @@
         </w:numPr>
         <w:spacing w:before="100" w:beforeAutospacing="1" w:after="100" w:afterAutospacing="1" w:line="240" w:lineRule="auto"/>
         <w:ind w:left="1095"/>
-        <w:jc w:val="both"/>
         <w:rPr>
           <w:rFonts w:ascii="Lato" w:eastAsia="Times New Roman" w:hAnsi="Lato" w:cs="Times New Roman"/>
           <w:color w:val="2D3B45"/>
@@ -1760,7 +1816,6 @@
         </w:numPr>
         <w:spacing w:before="100" w:beforeAutospacing="1" w:after="100" w:afterAutospacing="1" w:line="240" w:lineRule="auto"/>
         <w:ind w:left="1095"/>
-        <w:jc w:val="both"/>
         <w:rPr>
           <w:rFonts w:ascii="Lato" w:eastAsia="Times New Roman" w:hAnsi="Lato" w:cs="Times New Roman"/>
           <w:color w:val="2D3B45"/>
@@ -1785,7 +1840,6 @@
     <w:p>
       <w:pPr>
         <w:spacing w:before="180" w:after="180" w:line="240" w:lineRule="auto"/>
-        <w:jc w:val="both"/>
         <w:rPr>
           <w:rFonts w:ascii="Lato" w:eastAsia="Times New Roman" w:hAnsi="Lato" w:cs="Times New Roman"/>
           <w:color w:val="2D3B45"/>
@@ -2358,7 +2412,6 @@
     <w:p>
       <w:pPr>
         <w:spacing w:before="180" w:after="180" w:line="240" w:lineRule="auto"/>
-        <w:jc w:val="both"/>
         <w:rPr>
           <w:rFonts w:ascii="Lato" w:eastAsia="Times New Roman" w:hAnsi="Lato" w:cs="Times New Roman"/>
           <w:color w:val="2D3B45"/>
@@ -2438,7 +2491,6 @@
         </w:numPr>
         <w:spacing w:before="100" w:beforeAutospacing="1" w:after="100" w:afterAutospacing="1" w:line="240" w:lineRule="auto"/>
         <w:ind w:left="1095"/>
-        <w:jc w:val="both"/>
         <w:rPr>
           <w:rFonts w:ascii="Lato" w:eastAsia="Times New Roman" w:hAnsi="Lato" w:cs="Times New Roman"/>
           <w:color w:val="2D3B45"/>
@@ -2468,7 +2520,6 @@
         </w:numPr>
         <w:spacing w:before="100" w:beforeAutospacing="1" w:after="100" w:afterAutospacing="1" w:line="240" w:lineRule="auto"/>
         <w:ind w:left="1095"/>
-        <w:jc w:val="both"/>
         <w:rPr>
           <w:rFonts w:ascii="Lato" w:eastAsia="Times New Roman" w:hAnsi="Lato" w:cs="Times New Roman"/>
           <w:color w:val="2D3B45"/>
@@ -2498,7 +2549,6 @@
         </w:numPr>
         <w:spacing w:before="100" w:beforeAutospacing="1" w:after="100" w:afterAutospacing="1" w:line="240" w:lineRule="auto"/>
         <w:ind w:left="1095"/>
-        <w:jc w:val="both"/>
         <w:rPr>
           <w:rFonts w:ascii="Lato" w:eastAsia="Times New Roman" w:hAnsi="Lato" w:cs="Times New Roman"/>
           <w:color w:val="2D3B45"/>
@@ -2528,7 +2578,6 @@
         </w:numPr>
         <w:spacing w:before="100" w:beforeAutospacing="1" w:after="100" w:afterAutospacing="1" w:line="240" w:lineRule="auto"/>
         <w:ind w:left="1095"/>
-        <w:jc w:val="both"/>
         <w:rPr>
           <w:rFonts w:ascii="Lato" w:eastAsia="Times New Roman" w:hAnsi="Lato" w:cs="Times New Roman"/>
           <w:color w:val="2D3B45"/>
@@ -2558,7 +2607,6 @@
         </w:numPr>
         <w:spacing w:before="100" w:beforeAutospacing="1" w:after="100" w:afterAutospacing="1" w:line="240" w:lineRule="auto"/>
         <w:ind w:left="1095"/>
-        <w:jc w:val="both"/>
         <w:rPr>
           <w:rFonts w:ascii="Lato" w:eastAsia="Times New Roman" w:hAnsi="Lato" w:cs="Times New Roman"/>
           <w:color w:val="2D3B45"/>
@@ -2583,7 +2631,6 @@
     <w:p>
       <w:pPr>
         <w:spacing w:before="180" w:after="180" w:line="240" w:lineRule="auto"/>
-        <w:jc w:val="both"/>
         <w:rPr>
           <w:rFonts w:ascii="Lato" w:eastAsia="Times New Roman" w:hAnsi="Lato" w:cs="Times New Roman"/>
           <w:color w:val="2D3B45"/>
@@ -2658,7 +2705,6 @@
     <w:p>
       <w:pPr>
         <w:spacing w:before="180" w:after="180" w:line="240" w:lineRule="auto"/>
-        <w:jc w:val="both"/>
         <w:rPr>
           <w:rFonts w:ascii="Lato" w:eastAsia="Times New Roman" w:hAnsi="Lato" w:cs="Times New Roman"/>
           <w:color w:val="2D3B45"/>
@@ -2850,7 +2896,6 @@
     <w:p>
       <w:pPr>
         <w:spacing w:before="180" w:after="180" w:line="240" w:lineRule="auto"/>
-        <w:jc w:val="both"/>
         <w:rPr>
           <w:rFonts w:ascii="Lato" w:eastAsia="Times New Roman" w:hAnsi="Lato" w:cs="Times New Roman"/>
           <w:color w:val="2D3B45"/>
@@ -2987,7 +3032,6 @@
       <w:pPr>
         <w:spacing w:before="100" w:beforeAutospacing="1" w:after="100" w:afterAutospacing="1" w:line="240" w:lineRule="auto"/>
         <w:ind w:left="-76"/>
-        <w:jc w:val="both"/>
         <w:rPr>
           <w:rFonts w:ascii="Lato" w:eastAsia="Times New Roman" w:hAnsi="Lato" w:cs="Times New Roman"/>
           <w:color w:val="2D3B45"/>
@@ -3164,7 +3208,6 @@
     <w:p>
       <w:pPr>
         <w:spacing w:before="180" w:after="180" w:line="240" w:lineRule="auto"/>
-        <w:jc w:val="both"/>
         <w:rPr>
           <w:rFonts w:ascii="Lato" w:eastAsia="Times New Roman" w:hAnsi="Lato" w:cs="Times New Roman"/>
           <w:color w:val="2D3B45"/>
@@ -3270,7 +3313,6 @@
     <w:p>
       <w:pPr>
         <w:spacing w:before="180" w:after="180" w:line="240" w:lineRule="auto"/>
-        <w:jc w:val="both"/>
         <w:rPr>
           <w:rFonts w:ascii="Lato" w:eastAsia="Times New Roman" w:hAnsi="Lato" w:cs="Times New Roman"/>
           <w:color w:val="2D3B45"/>
@@ -3355,11 +3397,7 @@
         <w:t xml:space="preserve"> Spell out or define all acronyms and abbreviations used in the documents.</w:t>
       </w:r>
     </w:p>
-    <w:p>
-      <w:pPr>
-        <w:jc w:val="both"/>
-      </w:pPr>
-    </w:p>
+    <w:p/>
     <w:sectPr>
       <w:pgSz w:w="12240" w:h="15840"/>
       <w:pgMar w:top="1440" w:right="1440" w:bottom="1440" w:left="1440" w:header="720" w:footer="720" w:gutter="0"/>

</xml_diff>